<commit_message>
Preencher a capa, a folha de rosto e o slide de abertura
Faculdade Insted, Análise e Desenvolvimento de Sistemas, Laboratório de
Banco de Dados, Campo Grande, e os nomes dos quatro integrantes.

Co-Authored-By: Claude Opus 5.5 <noreply@anthropic.com>
Claude-Session: https://claude.ai/code/session_018B8K7s1KLwaUAhTA6Y1pFX
</commit_message>
<xml_diff>
--- a/Documentacao_Concessionaria_ABNT.docx
+++ b/Documentacao_Concessionaria_ABNT.docx
@@ -14,10 +14,8 @@
           <w:bCs/>
           <w:sz w:val="24"/>
           <w:szCs w:val="24"/>
-          <w:highlight w:val="yellow"/>
-          <w:highlightCs w:val="yellow"/>
-        </w:rPr>
-        <w:t xml:space="preserve">[NOME DA INSTITUIÇÃO]</w:t>
+        </w:rPr>
+        <w:t xml:space="preserve">FACULDADE INSTED</w:t>
       </w:r>
     </w:p>
     <w:p>
@@ -30,10 +28,8 @@
           <w:rFonts w:ascii="Arial" w:cs="Arial" w:eastAsia="Arial" w:hAnsi="Arial"/>
           <w:sz w:val="24"/>
           <w:szCs w:val="24"/>
-          <w:highlight w:val="yellow"/>
-          <w:highlightCs w:val="yellow"/>
-        </w:rPr>
-        <w:t xml:space="preserve">[NOME DO CURSO]</w:t>
+        </w:rPr>
+        <w:t xml:space="preserve">ANÁLISE E DESENVOLVIMENTO DE SISTEMAS</w:t>
       </w:r>
     </w:p>
     <w:p>
@@ -46,10 +42,8 @@
           <w:rFonts w:ascii="Arial" w:cs="Arial" w:eastAsia="Arial" w:hAnsi="Arial"/>
           <w:sz w:val="24"/>
           <w:szCs w:val="24"/>
-          <w:highlight w:val="yellow"/>
-          <w:highlightCs w:val="yellow"/>
-        </w:rPr>
-        <w:t xml:space="preserve">[NOME COMPLETO DO INTEGRANTE 1]</w:t>
+        </w:rPr>
+        <w:t xml:space="preserve">JOÃO VICTOR MULLER MIRANDA</w:t>
       </w:r>
     </w:p>
     <w:p>
@@ -62,10 +56,8 @@
           <w:rFonts w:ascii="Arial" w:cs="Arial" w:eastAsia="Arial" w:hAnsi="Arial"/>
           <w:sz w:val="24"/>
           <w:szCs w:val="24"/>
-          <w:highlight w:val="yellow"/>
-          <w:highlightCs w:val="yellow"/>
-        </w:rPr>
-        <w:t xml:space="preserve">[NOME COMPLETO DO INTEGRANTE 2]</w:t>
+        </w:rPr>
+        <w:t xml:space="preserve">JULIANO DOS SANTOS APOLINARIO ARAUJO</w:t>
       </w:r>
     </w:p>
     <w:p>
@@ -78,10 +70,8 @@
           <w:rFonts w:ascii="Arial" w:cs="Arial" w:eastAsia="Arial" w:hAnsi="Arial"/>
           <w:sz w:val="24"/>
           <w:szCs w:val="24"/>
-          <w:highlight w:val="yellow"/>
-          <w:highlightCs w:val="yellow"/>
-        </w:rPr>
-        <w:t xml:space="preserve">[NOME COMPLETO DO INTEGRANTE 3]</w:t>
+        </w:rPr>
+        <w:t xml:space="preserve">JÚLIO CÉSAR ZADI DE ASSIS DOS SANTOS</w:t>
       </w:r>
     </w:p>
     <w:p>
@@ -94,10 +84,8 @@
           <w:rFonts w:ascii="Arial" w:cs="Arial" w:eastAsia="Arial" w:hAnsi="Arial"/>
           <w:sz w:val="24"/>
           <w:szCs w:val="24"/>
-          <w:highlight w:val="yellow"/>
-          <w:highlightCs w:val="yellow"/>
-        </w:rPr>
-        <w:t xml:space="preserve">[NOME COMPLETO DO INTEGRANTE 4]</w:t>
+        </w:rPr>
+        <w:t xml:space="preserve">LUAN FLORES MARTINS</w:t>
       </w:r>
     </w:p>
     <w:p>
@@ -138,10 +126,8 @@
           <w:rFonts w:ascii="Arial" w:cs="Arial" w:eastAsia="Arial" w:hAnsi="Arial"/>
           <w:sz w:val="24"/>
           <w:szCs w:val="24"/>
-          <w:highlight w:val="yellow"/>
-          <w:highlightCs w:val="yellow"/>
-        </w:rPr>
-        <w:t xml:space="preserve">[NOME COMPLETO DO INTEGRANTE 1]</w:t>
+        </w:rPr>
+        <w:t xml:space="preserve">JOÃO VICTOR MULLER MIRANDA</w:t>
       </w:r>
     </w:p>
     <w:p>
@@ -154,10 +140,8 @@
           <w:rFonts w:ascii="Arial" w:cs="Arial" w:eastAsia="Arial" w:hAnsi="Arial"/>
           <w:sz w:val="24"/>
           <w:szCs w:val="24"/>
-          <w:highlight w:val="yellow"/>
-          <w:highlightCs w:val="yellow"/>
-        </w:rPr>
-        <w:t xml:space="preserve">[NOME COMPLETO DO INTEGRANTE 2]</w:t>
+        </w:rPr>
+        <w:t xml:space="preserve">JULIANO DOS SANTOS APOLINARIO ARAUJO</w:t>
       </w:r>
     </w:p>
     <w:p>
@@ -170,10 +154,8 @@
           <w:rFonts w:ascii="Arial" w:cs="Arial" w:eastAsia="Arial" w:hAnsi="Arial"/>
           <w:sz w:val="24"/>
           <w:szCs w:val="24"/>
-          <w:highlight w:val="yellow"/>
-          <w:highlightCs w:val="yellow"/>
-        </w:rPr>
-        <w:t xml:space="preserve">[NOME COMPLETO DO INTEGRANTE 3]</w:t>
+        </w:rPr>
+        <w:t xml:space="preserve">JÚLIO CÉSAR ZADI DE ASSIS DOS SANTOS</w:t>
       </w:r>
     </w:p>
     <w:p>
@@ -186,10 +168,8 @@
           <w:rFonts w:ascii="Arial" w:cs="Arial" w:eastAsia="Arial" w:hAnsi="Arial"/>
           <w:sz w:val="24"/>
           <w:szCs w:val="24"/>
-          <w:highlight w:val="yellow"/>
-          <w:highlightCs w:val="yellow"/>
-        </w:rPr>
-        <w:t xml:space="preserve">[NOME COMPLETO DO INTEGRANTE 4]</w:t>
+        </w:rPr>
+        <w:t xml:space="preserve">LUAN FLORES MARTINS</w:t>
       </w:r>
     </w:p>
     <w:p>
@@ -220,61 +200,7 @@
           <w:sz w:val="24"/>
           <w:szCs w:val="24"/>
         </w:rPr>
-        <w:t xml:space="preserve">Trabalho apresentado à disciplina de </w:t>
-      </w:r>
-      <w:r>
-        <w:rPr>
-          <w:rFonts w:ascii="Arial" w:cs="Arial" w:eastAsia="Arial" w:hAnsi="Arial"/>
-          <w:sz w:val="24"/>
-          <w:szCs w:val="24"/>
-          <w:highlight w:val="yellow"/>
-          <w:highlightCs w:val="yellow"/>
-        </w:rPr>
-        <w:t xml:space="preserve">[NOME DA DISCIPLINA]</w:t>
-      </w:r>
-      <w:r>
-        <w:rPr>
-          <w:rFonts w:ascii="Arial" w:cs="Arial" w:eastAsia="Arial" w:hAnsi="Arial"/>
-          <w:sz w:val="24"/>
-          <w:szCs w:val="24"/>
-        </w:rPr>
-        <w:t xml:space="preserve"> do curso de </w:t>
-      </w:r>
-      <w:r>
-        <w:rPr>
-          <w:rFonts w:ascii="Arial" w:cs="Arial" w:eastAsia="Arial" w:hAnsi="Arial"/>
-          <w:sz w:val="24"/>
-          <w:szCs w:val="24"/>
-          <w:highlight w:val="yellow"/>
-          <w:highlightCs w:val="yellow"/>
-        </w:rPr>
-        <w:t xml:space="preserve">[NOME DO CURSO]</w:t>
-      </w:r>
-      <w:r>
-        <w:rPr>
-          <w:rFonts w:ascii="Arial" w:cs="Arial" w:eastAsia="Arial" w:hAnsi="Arial"/>
-          <w:sz w:val="24"/>
-          <w:szCs w:val="24"/>
-        </w:rPr>
-        <w:t xml:space="preserve"> da </w:t>
-      </w:r>
-      <w:r>
-        <w:rPr>
-          <w:rFonts w:ascii="Arial" w:cs="Arial" w:eastAsia="Arial" w:hAnsi="Arial"/>
-          <w:sz w:val="24"/>
-          <w:szCs w:val="24"/>
-          <w:highlight w:val="yellow"/>
-          <w:highlightCs w:val="yellow"/>
-        </w:rPr>
-        <w:t xml:space="preserve">[NOME DA INSTITUIÇÃO]</w:t>
-      </w:r>
-      <w:r>
-        <w:rPr>
-          <w:rFonts w:ascii="Arial" w:cs="Arial" w:eastAsia="Arial" w:hAnsi="Arial"/>
-          <w:sz w:val="24"/>
-          <w:szCs w:val="24"/>
-        </w:rPr>
-        <w:t xml:space="preserve">, como requisito parcial para avaliação.</w:t>
+        <w:t xml:space="preserve">Trabalho apresentado à disciplina de Laboratório de Banco de Dados do curso de Análise e Desenvolvimento de Sistemas da Faculdade Insted, como requisito parcial para avaliação.</w:t>
       </w:r>
     </w:p>
     <w:p>
@@ -52140,10 +52066,8 @@
         <w:bCs/>
         <w:sz w:val="24"/>
         <w:szCs w:val="24"/>
-        <w:highlight w:val="yellow"/>
-        <w:highlightCs w:val="yellow"/>
       </w:rPr>
-      <w:t xml:space="preserve">[CIDADE]</w:t>
+      <w:t xml:space="preserve">CAMPO GRANDE</w:t>
     </w:r>
   </w:p>
   <w:p>
@@ -52185,10 +52109,8 @@
         <w:bCs/>
         <w:sz w:val="24"/>
         <w:szCs w:val="24"/>
-        <w:highlight w:val="yellow"/>
-        <w:highlightCs w:val="yellow"/>
       </w:rPr>
-      <w:t xml:space="preserve">[CIDADE]</w:t>
+      <w:t xml:space="preserve">CAMPO GRANDE</w:t>
     </w:r>
   </w:p>
   <w:p>

</xml_diff>

<commit_message>
Ajustar para o PostgreSQL 18 usado pelo grupo
A documentação, os slides e o cabeçalho dos scripts passam a citar o
PostgreSQL 18. Os scripts usam só recursos presentes desde a versão 10,
então rodam igual; a validação continua registrada no 16.13, onde foi
feita.

A consulta de restrições (Código 7) passa a filtrar por contype: a partir
do 18, as restrições NOT NULL também aparecem no pg_constraint e somariam
linhas sem tipo ao resultado.

Co-Authored-By: Claude Opus 5.5 <noreply@anthropic.com>
Claude-Session: https://claude.ai/code/session_018B8K7s1KLwaUAhTA6Y1pFX
</commit_message>
<xml_diff>
--- a/Documentacao_Concessionaria_ABNT.docx
+++ b/Documentacao_Concessionaria_ABNT.docx
@@ -247,7 +247,7 @@
           <w:sz w:val="24"/>
           <w:szCs w:val="24"/>
         </w:rPr>
-        <w:t xml:space="preserve">Este trabalho apresenta a implementação básica de um banco de dados relacional para um sistema de gestão de uma concessionária de veículos, que controla o cadastro de fornecedores, veículos, clientes e funcionários e o registro das vendas. Foi escolhido o Sistema Gerenciador de Banco de Dados (SGBD) PostgreSQL 16, por ser gratuito, de código aberto, aderente ao padrão SQL e oferecer transações, chaves estrangeiras e restrições de verificação. A modelagem foi desenvolvida em dois níveis: o Modelo Entidade-Relacionamento (MER), conceitual, e o Diagrama Entidade-Relacionamento (DER), lógico, complementados por um dicionário de dados. Em seguida, foram criados o banco de dados e a estrutura de cinco tabelas com comandos da linguagem de definição de dados, e realizada a carga de dados com os comandos INSERT, UPDATE e DELETE. Todos os comandos foram executados no PostgreSQL 16.13, e testes de integridade confirmaram que o SGBD recusa operações que deixariam os dados inconsistentes, como vender duas vezes o mesmo veículo ou excluir um cliente que possui compras registradas.</w:t>
+        <w:t xml:space="preserve">Este trabalho apresenta a implementação básica de um banco de dados relacional para um sistema de gestão de uma concessionária de veículos, que controla o cadastro de fornecedores, veículos, clientes e funcionários e o registro das vendas. Foi escolhido o Sistema Gerenciador de Banco de Dados (SGBD) PostgreSQL 18, por ser gratuito, de código aberto, aderente ao padrão SQL e oferecer transações, chaves estrangeiras e restrições de verificação. A modelagem foi desenvolvida em dois níveis: o Modelo Entidade-Relacionamento (MER), conceitual, e o Diagrama Entidade-Relacionamento (DER), lógico, complementados por um dicionário de dados. Em seguida, foram criados o banco de dados e a estrutura de cinco tabelas com comandos da linguagem de definição de dados, e realizada a carga de dados com os comandos INSERT, UPDATE e DELETE. Todos os comandos foram executados no PostgreSQL 16.13, e testes de integridade confirmaram que o SGBD recusa operações que deixariam os dados inconsistentes, como vender duas vezes o mesmo veículo ou excluir um cliente que possui compras registradas.</w:t>
       </w:r>
     </w:p>
     <w:p>
@@ -3012,7 +3012,7 @@
           <w:sz w:val="24"/>
           <w:szCs w:val="24"/>
         </w:rPr>
-        <w:t xml:space="preserve">, na versão 16. O PostgreSQL é um SGBD objeto-relacional de código aberto, desenvolvido por uma comunidade internacional, o PostgreSQL Global Development Group, e distribuído gratuitamente sob a licença PostgreSQL, semelhante às licenças BSD e MIT (THE POSTGRESQL GLOBAL DEVELOPMENT GROUP, 2026). A escolha considerou os seguintes critérios:</w:t>
+        <w:t xml:space="preserve">, na versão 18. O PostgreSQL é um SGBD objeto-relacional de código aberto, desenvolvido por uma comunidade internacional, o PostgreSQL Global Development Group, e distribuído gratuitamente sob a licença PostgreSQL, semelhante às licenças BSD e MIT (THE POSTGRESQL GLOBAL DEVELOPMENT GROUP, 2026). A escolha considerou os seguintes critérios:</w:t>
       </w:r>
     </w:p>
     <w:p>
@@ -3278,7 +3278,7 @@
                 <w:sz w:val="20"/>
                 <w:szCs w:val="20"/>
               </w:rPr>
-              <w:t xml:space="preserve">PostgreSQL 16</w:t>
+              <w:t xml:space="preserve">PostgreSQL 18</w:t>
             </w:r>
           </w:p>
         </w:tc>
@@ -4138,7 +4138,7 @@
           <w:sz w:val="24"/>
           <w:szCs w:val="24"/>
         </w:rPr>
-        <w:t xml:space="preserve">Os três atenderiam ao escopo do trabalho. O PostgreSQL foi escolhido por ser totalmente gratuito e aberto, sem edição comercial nem limites de uso, por seguir de perto o padrão SQL e por oferecer todos os recursos de integridade exigidos pelas regras de negócio da concessionária. Os comandos deste trabalho foram executados e validados no PostgreSQL 16.13, com a codificação UTF8, que representa corretamente os acentos da língua portuguesa.</w:t>
+        <w:t xml:space="preserve">Os três atenderiam ao escopo do trabalho. O PostgreSQL foi escolhido por ser totalmente gratuito e aberto, sem edição comercial nem limites de uso, por seguir de perto o padrão SQL e por oferecer todos os recursos de integridade exigidos pelas regras de negócio da concessionária. Os comandos deste trabalho foram executados e validados no PostgreSQL 16.13, com a codificação UTF8, que representa corretamente os acentos da língua portuguesa. Os scripts usam apenas recursos disponíveis desde a versão 10 do PostgreSQL, como as colunas de identidade, e por isso funcionam da mesma forma na versão 18, instalada nos computadores do grupo.</w:t>
       </w:r>
     </w:p>
     <w:p>
@@ -19969,7 +19969,39 @@
           <w:sz w:val="24"/>
           <w:szCs w:val="24"/>
         </w:rPr>
-        <w:t xml:space="preserve">) foi consultado com o Código 7. O resultado, no Quadro 10, mostra as 18 restrições criadas nas cinco tabelas: 5 chaves primárias, 4 restrições UNIQUE, 5 restrições CHECK e 4 chaves estrangeiras. As chaves primárias, que não foram declaradas com nome, receberam do PostgreSQL nomes no formato tabela_pkey.</w:t>
+        <w:t xml:space="preserve">) foi consultado com o Código 7. O resultado, no Quadro 10, mostra as 18 restrições criadas nas cinco tabelas: 5 chaves primárias, 4 restrições UNIQUE, 5 restrições CHECK e 4 chaves estrangeiras. As chaves primárias, que não foram declaradas com nome, receberam do PostgreSQL nomes no formato tabela_pkey. O filtro por </w:t>
+      </w:r>
+      <w:r>
+        <w:rPr>
+          <w:rFonts w:ascii="Courier New" w:cs="Courier New" w:eastAsia="Courier New" w:hAnsi="Courier New"/>
+          <w:sz w:val="22"/>
+          <w:szCs w:val="22"/>
+        </w:rPr>
+        <w:t xml:space="preserve">contype</w:t>
+      </w:r>
+      <w:r>
+        <w:rPr>
+          <w:rFonts w:ascii="Arial" w:cs="Arial" w:eastAsia="Arial" w:hAnsi="Arial"/>
+          <w:sz w:val="24"/>
+          <w:szCs w:val="24"/>
+        </w:rPr>
+        <w:t xml:space="preserve"> mantém o resultado igual em todas as versões: a partir do PostgreSQL 18, as restrições NOT NULL também passaram a ser registradas no </w:t>
+      </w:r>
+      <w:r>
+        <w:rPr>
+          <w:rFonts w:ascii="Courier New" w:cs="Courier New" w:eastAsia="Courier New" w:hAnsi="Courier New"/>
+          <w:sz w:val="22"/>
+          <w:szCs w:val="22"/>
+        </w:rPr>
+        <w:t xml:space="preserve">pg_constraint</w:t>
+      </w:r>
+      <w:r>
+        <w:rPr>
+          <w:rFonts w:ascii="Arial" w:cs="Arial" w:eastAsia="Arial" w:hAnsi="Arial"/>
+          <w:sz w:val="24"/>
+          <w:szCs w:val="24"/>
+        </w:rPr>
+        <w:t xml:space="preserve">, com o tipo 'n', e ficariam de fora da contagem acima.</w:t>
       </w:r>
     </w:p>
     <w:p>
@@ -20662,6 +20694,141 @@
                 <w:szCs w:val="18"/>
               </w:rPr>
               <w:t xml:space="preserve">regnamespace</w:t>
+            </w:r>
+          </w:p>
+          <w:p>
+            <w:pPr>
+              <w:spacing w:after="0" w:line="240"/>
+            </w:pPr>
+            <w:r>
+              <w:rPr>
+                <w:rFonts w:ascii="Courier New" w:cs="Courier New" w:eastAsia="Courier New" w:hAnsi="Courier New"/>
+                <w:sz w:val="18"/>
+                <w:szCs w:val="18"/>
+              </w:rPr>
+              <w:t xml:space="preserve">  </w:t>
+            </w:r>
+            <w:r>
+              <w:rPr>
+                <w:rFonts w:ascii="Courier New" w:cs="Courier New" w:eastAsia="Courier New" w:hAnsi="Courier New"/>
+                <w:b/>
+                <w:bCs/>
+                <w:color w:val="1F3A5F"/>
+                <w:sz w:val="18"/>
+                <w:szCs w:val="18"/>
+              </w:rPr>
+              <w:t xml:space="preserve">AND</w:t>
+            </w:r>
+            <w:r>
+              <w:rPr>
+                <w:rFonts w:ascii="Courier New" w:cs="Courier New" w:eastAsia="Courier New" w:hAnsi="Courier New"/>
+                <w:sz w:val="18"/>
+                <w:szCs w:val="18"/>
+              </w:rPr>
+              <w:t xml:space="preserve"> </w:t>
+            </w:r>
+            <w:r>
+              <w:rPr>
+                <w:rFonts w:ascii="Courier New" w:cs="Courier New" w:eastAsia="Courier New" w:hAnsi="Courier New"/>
+                <w:sz w:val="18"/>
+                <w:szCs w:val="18"/>
+              </w:rPr>
+              <w:t xml:space="preserve">contype</w:t>
+            </w:r>
+            <w:r>
+              <w:rPr>
+                <w:rFonts w:ascii="Courier New" w:cs="Courier New" w:eastAsia="Courier New" w:hAnsi="Courier New"/>
+                <w:sz w:val="18"/>
+                <w:szCs w:val="18"/>
+              </w:rPr>
+              <w:t xml:space="preserve"> </w:t>
+            </w:r>
+            <w:r>
+              <w:rPr>
+                <w:rFonts w:ascii="Courier New" w:cs="Courier New" w:eastAsia="Courier New" w:hAnsi="Courier New"/>
+                <w:b/>
+                <w:bCs/>
+                <w:color w:val="1F3A5F"/>
+                <w:sz w:val="18"/>
+                <w:szCs w:val="18"/>
+              </w:rPr>
+              <w:t xml:space="preserve">IN</w:t>
+            </w:r>
+            <w:r>
+              <w:rPr>
+                <w:rFonts w:ascii="Courier New" w:cs="Courier New" w:eastAsia="Courier New" w:hAnsi="Courier New"/>
+                <w:sz w:val="18"/>
+                <w:szCs w:val="18"/>
+              </w:rPr>
+              <w:t xml:space="preserve"> (</w:t>
+            </w:r>
+            <w:r>
+              <w:rPr>
+                <w:rFonts w:ascii="Courier New" w:cs="Courier New" w:eastAsia="Courier New" w:hAnsi="Courier New"/>
+                <w:color w:val="8B2E16"/>
+                <w:sz w:val="18"/>
+                <w:szCs w:val="18"/>
+              </w:rPr>
+              <w:t xml:space="preserve">'p'</w:t>
+            </w:r>
+            <w:r>
+              <w:rPr>
+                <w:rFonts w:ascii="Courier New" w:cs="Courier New" w:eastAsia="Courier New" w:hAnsi="Courier New"/>
+                <w:sz w:val="18"/>
+                <w:szCs w:val="18"/>
+              </w:rPr>
+              <w:t xml:space="preserve">, </w:t>
+            </w:r>
+            <w:r>
+              <w:rPr>
+                <w:rFonts w:ascii="Courier New" w:cs="Courier New" w:eastAsia="Courier New" w:hAnsi="Courier New"/>
+                <w:color w:val="8B2E16"/>
+                <w:sz w:val="18"/>
+                <w:szCs w:val="18"/>
+              </w:rPr>
+              <w:t xml:space="preserve">'u'</w:t>
+            </w:r>
+            <w:r>
+              <w:rPr>
+                <w:rFonts w:ascii="Courier New" w:cs="Courier New" w:eastAsia="Courier New" w:hAnsi="Courier New"/>
+                <w:sz w:val="18"/>
+                <w:szCs w:val="18"/>
+              </w:rPr>
+              <w:t xml:space="preserve">, </w:t>
+            </w:r>
+            <w:r>
+              <w:rPr>
+                <w:rFonts w:ascii="Courier New" w:cs="Courier New" w:eastAsia="Courier New" w:hAnsi="Courier New"/>
+                <w:color w:val="8B2E16"/>
+                <w:sz w:val="18"/>
+                <w:szCs w:val="18"/>
+              </w:rPr>
+              <w:t xml:space="preserve">'c'</w:t>
+            </w:r>
+            <w:r>
+              <w:rPr>
+                <w:rFonts w:ascii="Courier New" w:cs="Courier New" w:eastAsia="Courier New" w:hAnsi="Courier New"/>
+                <w:sz w:val="18"/>
+                <w:szCs w:val="18"/>
+              </w:rPr>
+              <w:t xml:space="preserve">, </w:t>
+            </w:r>
+            <w:r>
+              <w:rPr>
+                <w:rFonts w:ascii="Courier New" w:cs="Courier New" w:eastAsia="Courier New" w:hAnsi="Courier New"/>
+                <w:color w:val="8B2E16"/>
+                <w:sz w:val="18"/>
+                <w:szCs w:val="18"/>
+              </w:rPr>
+              <w:t xml:space="preserve">'f'</w:t>
+            </w:r>
+            <w:r>
+              <w:rPr>
+                <w:rFonts w:ascii="Courier New" w:cs="Courier New" w:eastAsia="Courier New" w:hAnsi="Courier New"/>
+                <w:sz w:val="18"/>
+                <w:szCs w:val="18"/>
+              </w:rPr>
+              <w:t xml:space="preserve">)</w:t>
             </w:r>
           </w:p>
           <w:p>
@@ -37839,7 +38006,7 @@
           <w:sz w:val="24"/>
           <w:szCs w:val="24"/>
         </w:rPr>
-        <w:t xml:space="preserve">O trabalho cumpriu as quatro etapas propostas: o SGBD PostgreSQL 16 foi definido e justificado, o banco </w:t>
+        <w:t xml:space="preserve">O trabalho cumpriu as quatro etapas propostas: o SGBD PostgreSQL 18 foi definido e justificado, o banco </w:t>
       </w:r>
       <w:r>
         <w:rPr>
@@ -38237,7 +38404,7 @@
           <w:sz w:val="24"/>
           <w:szCs w:val="24"/>
         </w:rPr>
-        <w:t xml:space="preserve">PostgreSQL 16 documentation</w:t>
+        <w:t xml:space="preserve">PostgreSQL 18 documentation</w:t>
       </w:r>
       <w:r>
         <w:rPr>
@@ -38263,7 +38430,7 @@
           <w:sz w:val="24"/>
           <w:szCs w:val="24"/>
         </w:rPr>
-        <w:t xml:space="preserve">]: The PostgreSQL Global Development Group, 2026. Disponível em: https://www.postgresql.org/docs/16/. Acesso em: 22 set. 2026.</w:t>
+        <w:t xml:space="preserve">]: The PostgreSQL Global Development Group, 2026. Disponível em: https://www.postgresql.org/docs/18/. Acesso em: 22 set. 2026.</w:t>
       </w:r>
     </w:p>
     <w:p>
@@ -38409,7 +38576,7 @@
                 <w:sz w:val="17"/>
                 <w:szCs w:val="17"/>
               </w:rPr>
-              <w:t xml:space="preserve">-- SGBD: PostgreSQL 16</w:t>
+              <w:t xml:space="preserve">-- SGBD: PostgreSQL 18 (compatível a partir da versão 10)</w:t>
             </w:r>
           </w:p>
           <w:p>
@@ -39000,7 +39167,7 @@
                 <w:sz w:val="17"/>
                 <w:szCs w:val="17"/>
               </w:rPr>
-              <w:t xml:space="preserve">-- SGBD: PostgreSQL 16</w:t>
+              <w:t xml:space="preserve">-- SGBD: PostgreSQL 18 (compatível a partir da versão 10)</w:t>
             </w:r>
           </w:p>
           <w:p>

</xml_diff>

<commit_message>
Pôr no script a consulta de conferência das restrições
A consulta do Código 7 só existia na documentação. Agora ela fica no
02_tabelas_e_carga.sql, logo após a criação das tabelas, e o documento
passa a recortá-la do próprio script, como os demais códigos.

Conferido: os Apêndices A e B são idênticos aos dois arquivos, todo
código da seção 5 está nos scripts, os 34 comandos dos scripts aparecem
na seção 5 e os valores dos quadros batem com uma execução nova.

Co-Authored-By: Claude Opus 5.5 <noreply@anthropic.com>
Claude-Session: https://claude.ai/code/session_018B8K7s1KLwaUAhTA6Y1pFX
</commit_message>
<xml_diff>
--- a/Documentacao_Concessionaria_ABNT.docx
+++ b/Documentacao_Concessionaria_ABNT.docx
@@ -44482,6 +44482,974 @@
                 <w:szCs w:val="17"/>
               </w:rPr>
               <w:t xml:space="preserve">);</w:t>
+            </w:r>
+          </w:p>
+          <w:p>
+            <w:pPr>
+              <w:spacing w:after="0" w:line="240"/>
+            </w:pPr>
+            <w:r>
+              <w:rPr>
+                <w:rFonts w:ascii="Courier New" w:cs="Courier New" w:eastAsia="Courier New" w:hAnsi="Courier New"/>
+                <w:sz w:val="17"/>
+                <w:szCs w:val="17"/>
+              </w:rPr>
+              <w:t xml:space="preserve"/>
+            </w:r>
+          </w:p>
+          <w:p>
+            <w:pPr>
+              <w:spacing w:after="0" w:line="240"/>
+            </w:pPr>
+            <w:r>
+              <w:rPr>
+                <w:rFonts w:ascii="Courier New" w:cs="Courier New" w:eastAsia="Courier New" w:hAnsi="Courier New"/>
+                <w:i/>
+                <w:iCs/>
+                <w:color w:val="6B7280"/>
+                <w:sz w:val="17"/>
+                <w:szCs w:val="17"/>
+              </w:rPr>
+              <w:t xml:space="preserve">-- Confere as restrições criadas, consultando o catálogo do PostgreSQL</w:t>
+            </w:r>
+          </w:p>
+          <w:p>
+            <w:pPr>
+              <w:spacing w:after="0" w:line="240"/>
+            </w:pPr>
+            <w:r>
+              <w:rPr>
+                <w:rFonts w:ascii="Courier New" w:cs="Courier New" w:eastAsia="Courier New" w:hAnsi="Courier New"/>
+                <w:i/>
+                <w:iCs/>
+                <w:color w:val="6B7280"/>
+                <w:sz w:val="17"/>
+                <w:szCs w:val="17"/>
+              </w:rPr>
+              <w:t xml:space="preserve">-- (o filtro por contype deixa de fora as NOT NULL, que o PostgreSQL 18</w:t>
+            </w:r>
+          </w:p>
+          <w:p>
+            <w:pPr>
+              <w:spacing w:after="0" w:line="240"/>
+            </w:pPr>
+            <w:r>
+              <w:rPr>
+                <w:rFonts w:ascii="Courier New" w:cs="Courier New" w:eastAsia="Courier New" w:hAnsi="Courier New"/>
+                <w:i/>
+                <w:iCs/>
+                <w:color w:val="6B7280"/>
+                <w:sz w:val="17"/>
+                <w:szCs w:val="17"/>
+              </w:rPr>
+              <w:t xml:space="preserve">-- também registra no pg_constraint)</w:t>
+            </w:r>
+          </w:p>
+          <w:p>
+            <w:pPr>
+              <w:spacing w:after="0" w:line="240"/>
+            </w:pPr>
+            <w:r>
+              <w:rPr>
+                <w:rFonts w:ascii="Courier New" w:cs="Courier New" w:eastAsia="Courier New" w:hAnsi="Courier New"/>
+                <w:b/>
+                <w:bCs/>
+                <w:color w:val="1F3A5F"/>
+                <w:sz w:val="17"/>
+                <w:szCs w:val="17"/>
+              </w:rPr>
+              <w:t xml:space="preserve">SELECT</w:t>
+            </w:r>
+            <w:r>
+              <w:rPr>
+                <w:rFonts w:ascii="Courier New" w:cs="Courier New" w:eastAsia="Courier New" w:hAnsi="Courier New"/>
+                <w:sz w:val="17"/>
+                <w:szCs w:val="17"/>
+              </w:rPr>
+              <w:t xml:space="preserve"> </w:t>
+            </w:r>
+            <w:r>
+              <w:rPr>
+                <w:rFonts w:ascii="Courier New" w:cs="Courier New" w:eastAsia="Courier New" w:hAnsi="Courier New"/>
+                <w:sz w:val="17"/>
+                <w:szCs w:val="17"/>
+              </w:rPr>
+              <w:t xml:space="preserve">conrelid</w:t>
+            </w:r>
+            <w:r>
+              <w:rPr>
+                <w:rFonts w:ascii="Courier New" w:cs="Courier New" w:eastAsia="Courier New" w:hAnsi="Courier New"/>
+                <w:sz w:val="17"/>
+                <w:szCs w:val="17"/>
+              </w:rPr>
+              <w:t xml:space="preserve">::</w:t>
+            </w:r>
+            <w:r>
+              <w:rPr>
+                <w:rFonts w:ascii="Courier New" w:cs="Courier New" w:eastAsia="Courier New" w:hAnsi="Courier New"/>
+                <w:sz w:val="17"/>
+                <w:szCs w:val="17"/>
+              </w:rPr>
+              <w:t xml:space="preserve">regclass</w:t>
+            </w:r>
+            <w:r>
+              <w:rPr>
+                <w:rFonts w:ascii="Courier New" w:cs="Courier New" w:eastAsia="Courier New" w:hAnsi="Courier New"/>
+                <w:sz w:val="17"/>
+                <w:szCs w:val="17"/>
+              </w:rPr>
+              <w:t xml:space="preserve"> </w:t>
+            </w:r>
+            <w:r>
+              <w:rPr>
+                <w:rFonts w:ascii="Courier New" w:cs="Courier New" w:eastAsia="Courier New" w:hAnsi="Courier New"/>
+                <w:b/>
+                <w:bCs/>
+                <w:color w:val="1F3A5F"/>
+                <w:sz w:val="17"/>
+                <w:szCs w:val="17"/>
+              </w:rPr>
+              <w:t xml:space="preserve">AS</w:t>
+            </w:r>
+            <w:r>
+              <w:rPr>
+                <w:rFonts w:ascii="Courier New" w:cs="Courier New" w:eastAsia="Courier New" w:hAnsi="Courier New"/>
+                <w:sz w:val="17"/>
+                <w:szCs w:val="17"/>
+              </w:rPr>
+              <w:t xml:space="preserve"> </w:t>
+            </w:r>
+            <w:r>
+              <w:rPr>
+                <w:rFonts w:ascii="Courier New" w:cs="Courier New" w:eastAsia="Courier New" w:hAnsi="Courier New"/>
+                <w:sz w:val="17"/>
+                <w:szCs w:val="17"/>
+              </w:rPr>
+              <w:t xml:space="preserve">tabela</w:t>
+            </w:r>
+            <w:r>
+              <w:rPr>
+                <w:rFonts w:ascii="Courier New" w:cs="Courier New" w:eastAsia="Courier New" w:hAnsi="Courier New"/>
+                <w:sz w:val="17"/>
+                <w:szCs w:val="17"/>
+              </w:rPr>
+              <w:t xml:space="preserve">,</w:t>
+            </w:r>
+          </w:p>
+          <w:p>
+            <w:pPr>
+              <w:spacing w:after="0" w:line="240"/>
+            </w:pPr>
+            <w:r>
+              <w:rPr>
+                <w:rFonts w:ascii="Courier New" w:cs="Courier New" w:eastAsia="Courier New" w:hAnsi="Courier New"/>
+                <w:sz w:val="17"/>
+                <w:szCs w:val="17"/>
+              </w:rPr>
+              <w:t xml:space="preserve">       </w:t>
+            </w:r>
+            <w:r>
+              <w:rPr>
+                <w:rFonts w:ascii="Courier New" w:cs="Courier New" w:eastAsia="Courier New" w:hAnsi="Courier New"/>
+                <w:sz w:val="17"/>
+                <w:szCs w:val="17"/>
+              </w:rPr>
+              <w:t xml:space="preserve">conname</w:t>
+            </w:r>
+            <w:r>
+              <w:rPr>
+                <w:rFonts w:ascii="Courier New" w:cs="Courier New" w:eastAsia="Courier New" w:hAnsi="Courier New"/>
+                <w:sz w:val="17"/>
+                <w:szCs w:val="17"/>
+              </w:rPr>
+              <w:t xml:space="preserve"> </w:t>
+            </w:r>
+            <w:r>
+              <w:rPr>
+                <w:rFonts w:ascii="Courier New" w:cs="Courier New" w:eastAsia="Courier New" w:hAnsi="Courier New"/>
+                <w:b/>
+                <w:bCs/>
+                <w:color w:val="1F3A5F"/>
+                <w:sz w:val="17"/>
+                <w:szCs w:val="17"/>
+              </w:rPr>
+              <w:t xml:space="preserve">AS</w:t>
+            </w:r>
+            <w:r>
+              <w:rPr>
+                <w:rFonts w:ascii="Courier New" w:cs="Courier New" w:eastAsia="Courier New" w:hAnsi="Courier New"/>
+                <w:sz w:val="17"/>
+                <w:szCs w:val="17"/>
+              </w:rPr>
+              <w:t xml:space="preserve"> </w:t>
+            </w:r>
+            <w:r>
+              <w:rPr>
+                <w:rFonts w:ascii="Courier New" w:cs="Courier New" w:eastAsia="Courier New" w:hAnsi="Courier New"/>
+                <w:sz w:val="17"/>
+                <w:szCs w:val="17"/>
+              </w:rPr>
+              <w:t xml:space="preserve">restricao</w:t>
+            </w:r>
+            <w:r>
+              <w:rPr>
+                <w:rFonts w:ascii="Courier New" w:cs="Courier New" w:eastAsia="Courier New" w:hAnsi="Courier New"/>
+                <w:sz w:val="17"/>
+                <w:szCs w:val="17"/>
+              </w:rPr>
+              <w:t xml:space="preserve">,</w:t>
+            </w:r>
+          </w:p>
+          <w:p>
+            <w:pPr>
+              <w:spacing w:after="0" w:line="240"/>
+            </w:pPr>
+            <w:r>
+              <w:rPr>
+                <w:rFonts w:ascii="Courier New" w:cs="Courier New" w:eastAsia="Courier New" w:hAnsi="Courier New"/>
+                <w:sz w:val="17"/>
+                <w:szCs w:val="17"/>
+              </w:rPr>
+              <w:t xml:space="preserve">       </w:t>
+            </w:r>
+            <w:r>
+              <w:rPr>
+                <w:rFonts w:ascii="Courier New" w:cs="Courier New" w:eastAsia="Courier New" w:hAnsi="Courier New"/>
+                <w:b/>
+                <w:bCs/>
+                <w:color w:val="1F3A5F"/>
+                <w:sz w:val="17"/>
+                <w:szCs w:val="17"/>
+              </w:rPr>
+              <w:t xml:space="preserve">CASE</w:t>
+            </w:r>
+            <w:r>
+              <w:rPr>
+                <w:rFonts w:ascii="Courier New" w:cs="Courier New" w:eastAsia="Courier New" w:hAnsi="Courier New"/>
+                <w:sz w:val="17"/>
+                <w:szCs w:val="17"/>
+              </w:rPr>
+              <w:t xml:space="preserve"> </w:t>
+            </w:r>
+            <w:r>
+              <w:rPr>
+                <w:rFonts w:ascii="Courier New" w:cs="Courier New" w:eastAsia="Courier New" w:hAnsi="Courier New"/>
+                <w:sz w:val="17"/>
+                <w:szCs w:val="17"/>
+              </w:rPr>
+              <w:t xml:space="preserve">contype</w:t>
+            </w:r>
+            <w:r>
+              <w:rPr>
+                <w:rFonts w:ascii="Courier New" w:cs="Courier New" w:eastAsia="Courier New" w:hAnsi="Courier New"/>
+                <w:sz w:val="17"/>
+                <w:szCs w:val="17"/>
+              </w:rPr>
+              <w:t xml:space="preserve"> </w:t>
+            </w:r>
+            <w:r>
+              <w:rPr>
+                <w:rFonts w:ascii="Courier New" w:cs="Courier New" w:eastAsia="Courier New" w:hAnsi="Courier New"/>
+                <w:b/>
+                <w:bCs/>
+                <w:color w:val="1F3A5F"/>
+                <w:sz w:val="17"/>
+                <w:szCs w:val="17"/>
+              </w:rPr>
+              <w:t xml:space="preserve">WHEN</w:t>
+            </w:r>
+            <w:r>
+              <w:rPr>
+                <w:rFonts w:ascii="Courier New" w:cs="Courier New" w:eastAsia="Courier New" w:hAnsi="Courier New"/>
+                <w:sz w:val="17"/>
+                <w:szCs w:val="17"/>
+              </w:rPr>
+              <w:t xml:space="preserve"> </w:t>
+            </w:r>
+            <w:r>
+              <w:rPr>
+                <w:rFonts w:ascii="Courier New" w:cs="Courier New" w:eastAsia="Courier New" w:hAnsi="Courier New"/>
+                <w:color w:val="8B2E16"/>
+                <w:sz w:val="17"/>
+                <w:szCs w:val="17"/>
+              </w:rPr>
+              <w:t xml:space="preserve">'p'</w:t>
+            </w:r>
+            <w:r>
+              <w:rPr>
+                <w:rFonts w:ascii="Courier New" w:cs="Courier New" w:eastAsia="Courier New" w:hAnsi="Courier New"/>
+                <w:sz w:val="17"/>
+                <w:szCs w:val="17"/>
+              </w:rPr>
+              <w:t xml:space="preserve"> </w:t>
+            </w:r>
+            <w:r>
+              <w:rPr>
+                <w:rFonts w:ascii="Courier New" w:cs="Courier New" w:eastAsia="Courier New" w:hAnsi="Courier New"/>
+                <w:b/>
+                <w:bCs/>
+                <w:color w:val="1F3A5F"/>
+                <w:sz w:val="17"/>
+                <w:szCs w:val="17"/>
+              </w:rPr>
+              <w:t xml:space="preserve">THEN</w:t>
+            </w:r>
+            <w:r>
+              <w:rPr>
+                <w:rFonts w:ascii="Courier New" w:cs="Courier New" w:eastAsia="Courier New" w:hAnsi="Courier New"/>
+                <w:sz w:val="17"/>
+                <w:szCs w:val="17"/>
+              </w:rPr>
+              <w:t xml:space="preserve"> </w:t>
+            </w:r>
+            <w:r>
+              <w:rPr>
+                <w:rFonts w:ascii="Courier New" w:cs="Courier New" w:eastAsia="Courier New" w:hAnsi="Courier New"/>
+                <w:color w:val="8B2E16"/>
+                <w:sz w:val="17"/>
+                <w:szCs w:val="17"/>
+              </w:rPr>
+              <w:t xml:space="preserve">'PRIMARY KEY'</w:t>
+            </w:r>
+          </w:p>
+          <w:p>
+            <w:pPr>
+              <w:spacing w:after="0" w:line="240"/>
+            </w:pPr>
+            <w:r>
+              <w:rPr>
+                <w:rFonts w:ascii="Courier New" w:cs="Courier New" w:eastAsia="Courier New" w:hAnsi="Courier New"/>
+                <w:sz w:val="17"/>
+                <w:szCs w:val="17"/>
+              </w:rPr>
+              <w:t xml:space="preserve">                    </w:t>
+            </w:r>
+            <w:r>
+              <w:rPr>
+                <w:rFonts w:ascii="Courier New" w:cs="Courier New" w:eastAsia="Courier New" w:hAnsi="Courier New"/>
+                <w:b/>
+                <w:bCs/>
+                <w:color w:val="1F3A5F"/>
+                <w:sz w:val="17"/>
+                <w:szCs w:val="17"/>
+              </w:rPr>
+              <w:t xml:space="preserve">WHEN</w:t>
+            </w:r>
+            <w:r>
+              <w:rPr>
+                <w:rFonts w:ascii="Courier New" w:cs="Courier New" w:eastAsia="Courier New" w:hAnsi="Courier New"/>
+                <w:sz w:val="17"/>
+                <w:szCs w:val="17"/>
+              </w:rPr>
+              <w:t xml:space="preserve"> </w:t>
+            </w:r>
+            <w:r>
+              <w:rPr>
+                <w:rFonts w:ascii="Courier New" w:cs="Courier New" w:eastAsia="Courier New" w:hAnsi="Courier New"/>
+                <w:color w:val="8B2E16"/>
+                <w:sz w:val="17"/>
+                <w:szCs w:val="17"/>
+              </w:rPr>
+              <w:t xml:space="preserve">'u'</w:t>
+            </w:r>
+            <w:r>
+              <w:rPr>
+                <w:rFonts w:ascii="Courier New" w:cs="Courier New" w:eastAsia="Courier New" w:hAnsi="Courier New"/>
+                <w:sz w:val="17"/>
+                <w:szCs w:val="17"/>
+              </w:rPr>
+              <w:t xml:space="preserve"> </w:t>
+            </w:r>
+            <w:r>
+              <w:rPr>
+                <w:rFonts w:ascii="Courier New" w:cs="Courier New" w:eastAsia="Courier New" w:hAnsi="Courier New"/>
+                <w:b/>
+                <w:bCs/>
+                <w:color w:val="1F3A5F"/>
+                <w:sz w:val="17"/>
+                <w:szCs w:val="17"/>
+              </w:rPr>
+              <w:t xml:space="preserve">THEN</w:t>
+            </w:r>
+            <w:r>
+              <w:rPr>
+                <w:rFonts w:ascii="Courier New" w:cs="Courier New" w:eastAsia="Courier New" w:hAnsi="Courier New"/>
+                <w:sz w:val="17"/>
+                <w:szCs w:val="17"/>
+              </w:rPr>
+              <w:t xml:space="preserve"> </w:t>
+            </w:r>
+            <w:r>
+              <w:rPr>
+                <w:rFonts w:ascii="Courier New" w:cs="Courier New" w:eastAsia="Courier New" w:hAnsi="Courier New"/>
+                <w:color w:val="8B2E16"/>
+                <w:sz w:val="17"/>
+                <w:szCs w:val="17"/>
+              </w:rPr>
+              <w:t xml:space="preserve">'UNIQUE'</w:t>
+            </w:r>
+          </w:p>
+          <w:p>
+            <w:pPr>
+              <w:spacing w:after="0" w:line="240"/>
+            </w:pPr>
+            <w:r>
+              <w:rPr>
+                <w:rFonts w:ascii="Courier New" w:cs="Courier New" w:eastAsia="Courier New" w:hAnsi="Courier New"/>
+                <w:sz w:val="17"/>
+                <w:szCs w:val="17"/>
+              </w:rPr>
+              <w:t xml:space="preserve">                    </w:t>
+            </w:r>
+            <w:r>
+              <w:rPr>
+                <w:rFonts w:ascii="Courier New" w:cs="Courier New" w:eastAsia="Courier New" w:hAnsi="Courier New"/>
+                <w:b/>
+                <w:bCs/>
+                <w:color w:val="1F3A5F"/>
+                <w:sz w:val="17"/>
+                <w:szCs w:val="17"/>
+              </w:rPr>
+              <w:t xml:space="preserve">WHEN</w:t>
+            </w:r>
+            <w:r>
+              <w:rPr>
+                <w:rFonts w:ascii="Courier New" w:cs="Courier New" w:eastAsia="Courier New" w:hAnsi="Courier New"/>
+                <w:sz w:val="17"/>
+                <w:szCs w:val="17"/>
+              </w:rPr>
+              <w:t xml:space="preserve"> </w:t>
+            </w:r>
+            <w:r>
+              <w:rPr>
+                <w:rFonts w:ascii="Courier New" w:cs="Courier New" w:eastAsia="Courier New" w:hAnsi="Courier New"/>
+                <w:color w:val="8B2E16"/>
+                <w:sz w:val="17"/>
+                <w:szCs w:val="17"/>
+              </w:rPr>
+              <w:t xml:space="preserve">'c'</w:t>
+            </w:r>
+            <w:r>
+              <w:rPr>
+                <w:rFonts w:ascii="Courier New" w:cs="Courier New" w:eastAsia="Courier New" w:hAnsi="Courier New"/>
+                <w:sz w:val="17"/>
+                <w:szCs w:val="17"/>
+              </w:rPr>
+              <w:t xml:space="preserve"> </w:t>
+            </w:r>
+            <w:r>
+              <w:rPr>
+                <w:rFonts w:ascii="Courier New" w:cs="Courier New" w:eastAsia="Courier New" w:hAnsi="Courier New"/>
+                <w:b/>
+                <w:bCs/>
+                <w:color w:val="1F3A5F"/>
+                <w:sz w:val="17"/>
+                <w:szCs w:val="17"/>
+              </w:rPr>
+              <w:t xml:space="preserve">THEN</w:t>
+            </w:r>
+            <w:r>
+              <w:rPr>
+                <w:rFonts w:ascii="Courier New" w:cs="Courier New" w:eastAsia="Courier New" w:hAnsi="Courier New"/>
+                <w:sz w:val="17"/>
+                <w:szCs w:val="17"/>
+              </w:rPr>
+              <w:t xml:space="preserve"> </w:t>
+            </w:r>
+            <w:r>
+              <w:rPr>
+                <w:rFonts w:ascii="Courier New" w:cs="Courier New" w:eastAsia="Courier New" w:hAnsi="Courier New"/>
+                <w:color w:val="8B2E16"/>
+                <w:sz w:val="17"/>
+                <w:szCs w:val="17"/>
+              </w:rPr>
+              <w:t xml:space="preserve">'CHECK'</w:t>
+            </w:r>
+          </w:p>
+          <w:p>
+            <w:pPr>
+              <w:spacing w:after="0" w:line="240"/>
+            </w:pPr>
+            <w:r>
+              <w:rPr>
+                <w:rFonts w:ascii="Courier New" w:cs="Courier New" w:eastAsia="Courier New" w:hAnsi="Courier New"/>
+                <w:sz w:val="17"/>
+                <w:szCs w:val="17"/>
+              </w:rPr>
+              <w:t xml:space="preserve">                    </w:t>
+            </w:r>
+            <w:r>
+              <w:rPr>
+                <w:rFonts w:ascii="Courier New" w:cs="Courier New" w:eastAsia="Courier New" w:hAnsi="Courier New"/>
+                <w:b/>
+                <w:bCs/>
+                <w:color w:val="1F3A5F"/>
+                <w:sz w:val="17"/>
+                <w:szCs w:val="17"/>
+              </w:rPr>
+              <w:t xml:space="preserve">WHEN</w:t>
+            </w:r>
+            <w:r>
+              <w:rPr>
+                <w:rFonts w:ascii="Courier New" w:cs="Courier New" w:eastAsia="Courier New" w:hAnsi="Courier New"/>
+                <w:sz w:val="17"/>
+                <w:szCs w:val="17"/>
+              </w:rPr>
+              <w:t xml:space="preserve"> </w:t>
+            </w:r>
+            <w:r>
+              <w:rPr>
+                <w:rFonts w:ascii="Courier New" w:cs="Courier New" w:eastAsia="Courier New" w:hAnsi="Courier New"/>
+                <w:color w:val="8B2E16"/>
+                <w:sz w:val="17"/>
+                <w:szCs w:val="17"/>
+              </w:rPr>
+              <w:t xml:space="preserve">'f'</w:t>
+            </w:r>
+            <w:r>
+              <w:rPr>
+                <w:rFonts w:ascii="Courier New" w:cs="Courier New" w:eastAsia="Courier New" w:hAnsi="Courier New"/>
+                <w:sz w:val="17"/>
+                <w:szCs w:val="17"/>
+              </w:rPr>
+              <w:t xml:space="preserve"> </w:t>
+            </w:r>
+            <w:r>
+              <w:rPr>
+                <w:rFonts w:ascii="Courier New" w:cs="Courier New" w:eastAsia="Courier New" w:hAnsi="Courier New"/>
+                <w:b/>
+                <w:bCs/>
+                <w:color w:val="1F3A5F"/>
+                <w:sz w:val="17"/>
+                <w:szCs w:val="17"/>
+              </w:rPr>
+              <w:t xml:space="preserve">THEN</w:t>
+            </w:r>
+            <w:r>
+              <w:rPr>
+                <w:rFonts w:ascii="Courier New" w:cs="Courier New" w:eastAsia="Courier New" w:hAnsi="Courier New"/>
+                <w:sz w:val="17"/>
+                <w:szCs w:val="17"/>
+              </w:rPr>
+              <w:t xml:space="preserve"> </w:t>
+            </w:r>
+            <w:r>
+              <w:rPr>
+                <w:rFonts w:ascii="Courier New" w:cs="Courier New" w:eastAsia="Courier New" w:hAnsi="Courier New"/>
+                <w:color w:val="8B2E16"/>
+                <w:sz w:val="17"/>
+                <w:szCs w:val="17"/>
+              </w:rPr>
+              <w:t xml:space="preserve">'FOREIGN KEY'</w:t>
+            </w:r>
+            <w:r>
+              <w:rPr>
+                <w:rFonts w:ascii="Courier New" w:cs="Courier New" w:eastAsia="Courier New" w:hAnsi="Courier New"/>
+                <w:sz w:val="17"/>
+                <w:szCs w:val="17"/>
+              </w:rPr>
+              <w:t xml:space="preserve"> </w:t>
+            </w:r>
+            <w:r>
+              <w:rPr>
+                <w:rFonts w:ascii="Courier New" w:cs="Courier New" w:eastAsia="Courier New" w:hAnsi="Courier New"/>
+                <w:b/>
+                <w:bCs/>
+                <w:color w:val="1F3A5F"/>
+                <w:sz w:val="17"/>
+                <w:szCs w:val="17"/>
+              </w:rPr>
+              <w:t xml:space="preserve">END</w:t>
+            </w:r>
+            <w:r>
+              <w:rPr>
+                <w:rFonts w:ascii="Courier New" w:cs="Courier New" w:eastAsia="Courier New" w:hAnsi="Courier New"/>
+                <w:sz w:val="17"/>
+                <w:szCs w:val="17"/>
+              </w:rPr>
+              <w:t xml:space="preserve"> </w:t>
+            </w:r>
+            <w:r>
+              <w:rPr>
+                <w:rFonts w:ascii="Courier New" w:cs="Courier New" w:eastAsia="Courier New" w:hAnsi="Courier New"/>
+                <w:b/>
+                <w:bCs/>
+                <w:color w:val="1F3A5F"/>
+                <w:sz w:val="17"/>
+                <w:szCs w:val="17"/>
+              </w:rPr>
+              <w:t xml:space="preserve">AS</w:t>
+            </w:r>
+            <w:r>
+              <w:rPr>
+                <w:rFonts w:ascii="Courier New" w:cs="Courier New" w:eastAsia="Courier New" w:hAnsi="Courier New"/>
+                <w:sz w:val="17"/>
+                <w:szCs w:val="17"/>
+              </w:rPr>
+              <w:t xml:space="preserve"> </w:t>
+            </w:r>
+            <w:r>
+              <w:rPr>
+                <w:rFonts w:ascii="Courier New" w:cs="Courier New" w:eastAsia="Courier New" w:hAnsi="Courier New"/>
+                <w:sz w:val="17"/>
+                <w:szCs w:val="17"/>
+              </w:rPr>
+              <w:t xml:space="preserve">tipo</w:t>
+            </w:r>
+          </w:p>
+          <w:p>
+            <w:pPr>
+              <w:spacing w:after="0" w:line="240"/>
+            </w:pPr>
+            <w:r>
+              <w:rPr>
+                <w:rFonts w:ascii="Courier New" w:cs="Courier New" w:eastAsia="Courier New" w:hAnsi="Courier New"/>
+                <w:b/>
+                <w:bCs/>
+                <w:color w:val="1F3A5F"/>
+                <w:sz w:val="17"/>
+                <w:szCs w:val="17"/>
+              </w:rPr>
+              <w:t xml:space="preserve">FROM</w:t>
+            </w:r>
+            <w:r>
+              <w:rPr>
+                <w:rFonts w:ascii="Courier New" w:cs="Courier New" w:eastAsia="Courier New" w:hAnsi="Courier New"/>
+                <w:sz w:val="17"/>
+                <w:szCs w:val="17"/>
+              </w:rPr>
+              <w:t xml:space="preserve"> </w:t>
+            </w:r>
+            <w:r>
+              <w:rPr>
+                <w:rFonts w:ascii="Courier New" w:cs="Courier New" w:eastAsia="Courier New" w:hAnsi="Courier New"/>
+                <w:sz w:val="17"/>
+                <w:szCs w:val="17"/>
+              </w:rPr>
+              <w:t xml:space="preserve">pg_constraint</w:t>
+            </w:r>
+          </w:p>
+          <w:p>
+            <w:pPr>
+              <w:spacing w:after="0" w:line="240"/>
+            </w:pPr>
+            <w:r>
+              <w:rPr>
+                <w:rFonts w:ascii="Courier New" w:cs="Courier New" w:eastAsia="Courier New" w:hAnsi="Courier New"/>
+                <w:b/>
+                <w:bCs/>
+                <w:color w:val="1F3A5F"/>
+                <w:sz w:val="17"/>
+                <w:szCs w:val="17"/>
+              </w:rPr>
+              <w:t xml:space="preserve">WHERE</w:t>
+            </w:r>
+            <w:r>
+              <w:rPr>
+                <w:rFonts w:ascii="Courier New" w:cs="Courier New" w:eastAsia="Courier New" w:hAnsi="Courier New"/>
+                <w:sz w:val="17"/>
+                <w:szCs w:val="17"/>
+              </w:rPr>
+              <w:t xml:space="preserve"> </w:t>
+            </w:r>
+            <w:r>
+              <w:rPr>
+                <w:rFonts w:ascii="Courier New" w:cs="Courier New" w:eastAsia="Courier New" w:hAnsi="Courier New"/>
+                <w:sz w:val="17"/>
+                <w:szCs w:val="17"/>
+              </w:rPr>
+              <w:t xml:space="preserve">connamespace</w:t>
+            </w:r>
+            <w:r>
+              <w:rPr>
+                <w:rFonts w:ascii="Courier New" w:cs="Courier New" w:eastAsia="Courier New" w:hAnsi="Courier New"/>
+                <w:sz w:val="17"/>
+                <w:szCs w:val="17"/>
+              </w:rPr>
+              <w:t xml:space="preserve"> = </w:t>
+            </w:r>
+            <w:r>
+              <w:rPr>
+                <w:rFonts w:ascii="Courier New" w:cs="Courier New" w:eastAsia="Courier New" w:hAnsi="Courier New"/>
+                <w:color w:val="8B2E16"/>
+                <w:sz w:val="17"/>
+                <w:szCs w:val="17"/>
+              </w:rPr>
+              <w:t xml:space="preserve">'public'</w:t>
+            </w:r>
+            <w:r>
+              <w:rPr>
+                <w:rFonts w:ascii="Courier New" w:cs="Courier New" w:eastAsia="Courier New" w:hAnsi="Courier New"/>
+                <w:sz w:val="17"/>
+                <w:szCs w:val="17"/>
+              </w:rPr>
+              <w:t xml:space="preserve">::</w:t>
+            </w:r>
+            <w:r>
+              <w:rPr>
+                <w:rFonts w:ascii="Courier New" w:cs="Courier New" w:eastAsia="Courier New" w:hAnsi="Courier New"/>
+                <w:sz w:val="17"/>
+                <w:szCs w:val="17"/>
+              </w:rPr>
+              <w:t xml:space="preserve">regnamespace</w:t>
+            </w:r>
+          </w:p>
+          <w:p>
+            <w:pPr>
+              <w:spacing w:after="0" w:line="240"/>
+            </w:pPr>
+            <w:r>
+              <w:rPr>
+                <w:rFonts w:ascii="Courier New" w:cs="Courier New" w:eastAsia="Courier New" w:hAnsi="Courier New"/>
+                <w:sz w:val="17"/>
+                <w:szCs w:val="17"/>
+              </w:rPr>
+              <w:t xml:space="preserve">  </w:t>
+            </w:r>
+            <w:r>
+              <w:rPr>
+                <w:rFonts w:ascii="Courier New" w:cs="Courier New" w:eastAsia="Courier New" w:hAnsi="Courier New"/>
+                <w:b/>
+                <w:bCs/>
+                <w:color w:val="1F3A5F"/>
+                <w:sz w:val="17"/>
+                <w:szCs w:val="17"/>
+              </w:rPr>
+              <w:t xml:space="preserve">AND</w:t>
+            </w:r>
+            <w:r>
+              <w:rPr>
+                <w:rFonts w:ascii="Courier New" w:cs="Courier New" w:eastAsia="Courier New" w:hAnsi="Courier New"/>
+                <w:sz w:val="17"/>
+                <w:szCs w:val="17"/>
+              </w:rPr>
+              <w:t xml:space="preserve"> </w:t>
+            </w:r>
+            <w:r>
+              <w:rPr>
+                <w:rFonts w:ascii="Courier New" w:cs="Courier New" w:eastAsia="Courier New" w:hAnsi="Courier New"/>
+                <w:sz w:val="17"/>
+                <w:szCs w:val="17"/>
+              </w:rPr>
+              <w:t xml:space="preserve">contype</w:t>
+            </w:r>
+            <w:r>
+              <w:rPr>
+                <w:rFonts w:ascii="Courier New" w:cs="Courier New" w:eastAsia="Courier New" w:hAnsi="Courier New"/>
+                <w:sz w:val="17"/>
+                <w:szCs w:val="17"/>
+              </w:rPr>
+              <w:t xml:space="preserve"> </w:t>
+            </w:r>
+            <w:r>
+              <w:rPr>
+                <w:rFonts w:ascii="Courier New" w:cs="Courier New" w:eastAsia="Courier New" w:hAnsi="Courier New"/>
+                <w:b/>
+                <w:bCs/>
+                <w:color w:val="1F3A5F"/>
+                <w:sz w:val="17"/>
+                <w:szCs w:val="17"/>
+              </w:rPr>
+              <w:t xml:space="preserve">IN</w:t>
+            </w:r>
+            <w:r>
+              <w:rPr>
+                <w:rFonts w:ascii="Courier New" w:cs="Courier New" w:eastAsia="Courier New" w:hAnsi="Courier New"/>
+                <w:sz w:val="17"/>
+                <w:szCs w:val="17"/>
+              </w:rPr>
+              <w:t xml:space="preserve"> (</w:t>
+            </w:r>
+            <w:r>
+              <w:rPr>
+                <w:rFonts w:ascii="Courier New" w:cs="Courier New" w:eastAsia="Courier New" w:hAnsi="Courier New"/>
+                <w:color w:val="8B2E16"/>
+                <w:sz w:val="17"/>
+                <w:szCs w:val="17"/>
+              </w:rPr>
+              <w:t xml:space="preserve">'p'</w:t>
+            </w:r>
+            <w:r>
+              <w:rPr>
+                <w:rFonts w:ascii="Courier New" w:cs="Courier New" w:eastAsia="Courier New" w:hAnsi="Courier New"/>
+                <w:sz w:val="17"/>
+                <w:szCs w:val="17"/>
+              </w:rPr>
+              <w:t xml:space="preserve">, </w:t>
+            </w:r>
+            <w:r>
+              <w:rPr>
+                <w:rFonts w:ascii="Courier New" w:cs="Courier New" w:eastAsia="Courier New" w:hAnsi="Courier New"/>
+                <w:color w:val="8B2E16"/>
+                <w:sz w:val="17"/>
+                <w:szCs w:val="17"/>
+              </w:rPr>
+              <w:t xml:space="preserve">'u'</w:t>
+            </w:r>
+            <w:r>
+              <w:rPr>
+                <w:rFonts w:ascii="Courier New" w:cs="Courier New" w:eastAsia="Courier New" w:hAnsi="Courier New"/>
+                <w:sz w:val="17"/>
+                <w:szCs w:val="17"/>
+              </w:rPr>
+              <w:t xml:space="preserve">, </w:t>
+            </w:r>
+            <w:r>
+              <w:rPr>
+                <w:rFonts w:ascii="Courier New" w:cs="Courier New" w:eastAsia="Courier New" w:hAnsi="Courier New"/>
+                <w:color w:val="8B2E16"/>
+                <w:sz w:val="17"/>
+                <w:szCs w:val="17"/>
+              </w:rPr>
+              <w:t xml:space="preserve">'c'</w:t>
+            </w:r>
+            <w:r>
+              <w:rPr>
+                <w:rFonts w:ascii="Courier New" w:cs="Courier New" w:eastAsia="Courier New" w:hAnsi="Courier New"/>
+                <w:sz w:val="17"/>
+                <w:szCs w:val="17"/>
+              </w:rPr>
+              <w:t xml:space="preserve">, </w:t>
+            </w:r>
+            <w:r>
+              <w:rPr>
+                <w:rFonts w:ascii="Courier New" w:cs="Courier New" w:eastAsia="Courier New" w:hAnsi="Courier New"/>
+                <w:color w:val="8B2E16"/>
+                <w:sz w:val="17"/>
+                <w:szCs w:val="17"/>
+              </w:rPr>
+              <w:t xml:space="preserve">'f'</w:t>
+            </w:r>
+            <w:r>
+              <w:rPr>
+                <w:rFonts w:ascii="Courier New" w:cs="Courier New" w:eastAsia="Courier New" w:hAnsi="Courier New"/>
+                <w:sz w:val="17"/>
+                <w:szCs w:val="17"/>
+              </w:rPr>
+              <w:t xml:space="preserve">)</w:t>
+            </w:r>
+          </w:p>
+          <w:p>
+            <w:pPr>
+              <w:spacing w:after="0" w:line="240"/>
+            </w:pPr>
+            <w:r>
+              <w:rPr>
+                <w:rFonts w:ascii="Courier New" w:cs="Courier New" w:eastAsia="Courier New" w:hAnsi="Courier New"/>
+                <w:b/>
+                <w:bCs/>
+                <w:color w:val="1F3A5F"/>
+                <w:sz w:val="17"/>
+                <w:szCs w:val="17"/>
+              </w:rPr>
+              <w:t xml:space="preserve">ORDER</w:t>
+            </w:r>
+            <w:r>
+              <w:rPr>
+                <w:rFonts w:ascii="Courier New" w:cs="Courier New" w:eastAsia="Courier New" w:hAnsi="Courier New"/>
+                <w:sz w:val="17"/>
+                <w:szCs w:val="17"/>
+              </w:rPr>
+              <w:t xml:space="preserve"> </w:t>
+            </w:r>
+            <w:r>
+              <w:rPr>
+                <w:rFonts w:ascii="Courier New" w:cs="Courier New" w:eastAsia="Courier New" w:hAnsi="Courier New"/>
+                <w:b/>
+                <w:bCs/>
+                <w:color w:val="1F3A5F"/>
+                <w:sz w:val="17"/>
+                <w:szCs w:val="17"/>
+              </w:rPr>
+              <w:t xml:space="preserve">BY</w:t>
+            </w:r>
+            <w:r>
+              <w:rPr>
+                <w:rFonts w:ascii="Courier New" w:cs="Courier New" w:eastAsia="Courier New" w:hAnsi="Courier New"/>
+                <w:sz w:val="17"/>
+                <w:szCs w:val="17"/>
+              </w:rPr>
+              <w:t xml:space="preserve"> </w:t>
+            </w:r>
+            <w:r>
+              <w:rPr>
+                <w:rFonts w:ascii="Courier New" w:cs="Courier New" w:eastAsia="Courier New" w:hAnsi="Courier New"/>
+                <w:sz w:val="17"/>
+                <w:szCs w:val="17"/>
+              </w:rPr>
+              <w:t xml:space="preserve">conrelid</w:t>
+            </w:r>
+            <w:r>
+              <w:rPr>
+                <w:rFonts w:ascii="Courier New" w:cs="Courier New" w:eastAsia="Courier New" w:hAnsi="Courier New"/>
+                <w:sz w:val="17"/>
+                <w:szCs w:val="17"/>
+              </w:rPr>
+              <w:t xml:space="preserve">::</w:t>
+            </w:r>
+            <w:r>
+              <w:rPr>
+                <w:rFonts w:ascii="Courier New" w:cs="Courier New" w:eastAsia="Courier New" w:hAnsi="Courier New"/>
+                <w:sz w:val="17"/>
+                <w:szCs w:val="17"/>
+              </w:rPr>
+              <w:t xml:space="preserve">regclass</w:t>
+            </w:r>
+            <w:r>
+              <w:rPr>
+                <w:rFonts w:ascii="Courier New" w:cs="Courier New" w:eastAsia="Courier New" w:hAnsi="Courier New"/>
+                <w:sz w:val="17"/>
+                <w:szCs w:val="17"/>
+              </w:rPr>
+              <w:t xml:space="preserve">::</w:t>
+            </w:r>
+            <w:r>
+              <w:rPr>
+                <w:rFonts w:ascii="Courier New" w:cs="Courier New" w:eastAsia="Courier New" w:hAnsi="Courier New"/>
+                <w:sz w:val="17"/>
+                <w:szCs w:val="17"/>
+              </w:rPr>
+              <w:t xml:space="preserve">text</w:t>
+            </w:r>
+            <w:r>
+              <w:rPr>
+                <w:rFonts w:ascii="Courier New" w:cs="Courier New" w:eastAsia="Courier New" w:hAnsi="Courier New"/>
+                <w:sz w:val="17"/>
+                <w:szCs w:val="17"/>
+              </w:rPr>
+              <w:t xml:space="preserve">, </w:t>
+            </w:r>
+            <w:r>
+              <w:rPr>
+                <w:rFonts w:ascii="Courier New" w:cs="Courier New" w:eastAsia="Courier New" w:hAnsi="Courier New"/>
+                <w:sz w:val="17"/>
+                <w:szCs w:val="17"/>
+              </w:rPr>
+              <w:t xml:space="preserve">tipo</w:t>
+            </w:r>
+            <w:r>
+              <w:rPr>
+                <w:rFonts w:ascii="Courier New" w:cs="Courier New" w:eastAsia="Courier New" w:hAnsi="Courier New"/>
+                <w:sz w:val="17"/>
+                <w:szCs w:val="17"/>
+              </w:rPr>
+              <w:t xml:space="preserve">, </w:t>
+            </w:r>
+            <w:r>
+              <w:rPr>
+                <w:rFonts w:ascii="Courier New" w:cs="Courier New" w:eastAsia="Courier New" w:hAnsi="Courier New"/>
+                <w:sz w:val="17"/>
+                <w:szCs w:val="17"/>
+              </w:rPr>
+              <w:t xml:space="preserve">conname</w:t>
+            </w:r>
+            <w:r>
+              <w:rPr>
+                <w:rFonts w:ascii="Courier New" w:cs="Courier New" w:eastAsia="Courier New" w:hAnsi="Courier New"/>
+                <w:sz w:val="17"/>
+                <w:szCs w:val="17"/>
+              </w:rPr>
+              <w:t xml:space="preserve">;</w:t>
             </w:r>
           </w:p>
           <w:p>

</xml_diff>